<commit_message>
Adding format conversion script
</commit_message>
<xml_diff>
--- a/resume/resume.docx
+++ b/resume/resume.docx
@@ -101,7 +101,7 @@
             <w:sz w:val="20"/>
             <w:szCs w:val="20"/>
           </w:rPr>
-          <w:t>aetxe.plus@outlook.com</w:t>
+          <w:t>nablaservices@outlook.com</w:t>
         </w:r>
       </w:hyperlink>
     </w:p>
@@ -341,6 +341,101 @@
           <w:sz w:val="20"/>
           <w:szCs w:val="20"/>
         </w:rPr>
+        <w:t>• Experience with Infrastructure as Code (</w:t>
+      </w:r>
+      <w:proofErr w:type="spellStart"/>
+      <w:r>
+        <w:rPr>
+          <w:sz w:val="20"/>
+          <w:szCs w:val="20"/>
+        </w:rPr>
+        <w:t>IaC</w:t>
+      </w:r>
+      <w:proofErr w:type="spellEnd"/>
+      <w:r>
+        <w:rPr>
+          <w:sz w:val="20"/>
+          <w:szCs w:val="20"/>
+        </w:rPr>
+        <w:t>) using ARM and Terraform.</w:t>
+      </w:r>
+    </w:p>
+    <w:p>
+      <w:pPr>
+        <w:spacing w:after="0" w:line="240" w:lineRule="auto"/>
+        <w:ind w:left="720"/>
+        <w:rPr>
+          <w:sz w:val="20"/>
+          <w:szCs w:val="20"/>
+        </w:rPr>
+      </w:pPr>
+      <w:r>
+        <w:rPr>
+          <w:sz w:val="20"/>
+          <w:szCs w:val="20"/>
+        </w:rPr>
+        <w:t>• CI/CD tools and practices like Azure DevOps</w:t>
+      </w:r>
+      <w:r>
+        <w:rPr>
+          <w:sz w:val="20"/>
+          <w:szCs w:val="20"/>
+        </w:rPr>
+        <w:t xml:space="preserve">, </w:t>
+      </w:r>
+      <w:r>
+        <w:rPr>
+          <w:sz w:val="20"/>
+          <w:szCs w:val="20"/>
+        </w:rPr>
+        <w:t>GitHub Actions</w:t>
+      </w:r>
+      <w:r>
+        <w:rPr>
+          <w:sz w:val="20"/>
+          <w:szCs w:val="20"/>
+        </w:rPr>
+        <w:t>, and Drone.</w:t>
+      </w:r>
+    </w:p>
+    <w:p>
+      <w:pPr>
+        <w:spacing w:after="0" w:line="240" w:lineRule="auto"/>
+        <w:ind w:left="720"/>
+        <w:rPr>
+          <w:sz w:val="20"/>
+          <w:szCs w:val="20"/>
+        </w:rPr>
+      </w:pPr>
+      <w:r>
+        <w:rPr>
+          <w:sz w:val="20"/>
+          <w:szCs w:val="20"/>
+        </w:rPr>
+        <w:t>• Containerization and orchestration with Docker and Kubernetes</w:t>
+      </w:r>
+      <w:r>
+        <w:rPr>
+          <w:sz w:val="20"/>
+          <w:szCs w:val="20"/>
+        </w:rPr>
+        <w:t>.</w:t>
+      </w:r>
+    </w:p>
+    <w:p>
+      <w:pPr>
+        <w:spacing w:after="0" w:line="240" w:lineRule="auto"/>
+        <w:ind w:left="720"/>
+        <w:rPr>
+          <w:sz w:val="20"/>
+          <w:szCs w:val="20"/>
+        </w:rPr>
+      </w:pPr>
+      <w:r>
+        <w:rPr>
+          <w:sz w:val="20"/>
+          <w:szCs w:val="20"/>
+        </w:rPr>
         <w:t>• Frameworks expertise includes .NET, Node.js, Entity Framework, and Microsoft Fabric.</w:t>
       </w:r>
     </w:p>
@@ -375,6 +470,23 @@
           <w:sz w:val="20"/>
           <w:szCs w:val="20"/>
         </w:rPr>
+        <w:t>• Comprehensive understanding of Software Development Lifecycle (SDL), including Scrum, Agile, and DevOps.</w:t>
+      </w:r>
+    </w:p>
+    <w:p>
+      <w:pPr>
+        <w:spacing w:after="0" w:line="240" w:lineRule="auto"/>
+        <w:ind w:left="720"/>
+        <w:rPr>
+          <w:sz w:val="20"/>
+          <w:szCs w:val="20"/>
+        </w:rPr>
+      </w:pPr>
+      <w:r>
+        <w:rPr>
+          <w:sz w:val="20"/>
+          <w:szCs w:val="20"/>
+        </w:rPr>
         <w:t>• Cloud security and threat modeling expertise, including identity and authentication (SAML, OAuth2.0, SSO).</w:t>
       </w:r>
     </w:p>
@@ -409,73 +521,6 @@
           <w:sz w:val="20"/>
           <w:szCs w:val="20"/>
         </w:rPr>
-        <w:t>• Experience with Infrastructure as Code (</w:t>
-      </w:r>
-      <w:proofErr w:type="spellStart"/>
-      <w:r>
-        <w:rPr>
-          <w:sz w:val="20"/>
-          <w:szCs w:val="20"/>
-        </w:rPr>
-        <w:t>IaC</w:t>
-      </w:r>
-      <w:proofErr w:type="spellEnd"/>
-      <w:r>
-        <w:rPr>
-          <w:sz w:val="20"/>
-          <w:szCs w:val="20"/>
-        </w:rPr>
-        <w:t>) using ARM and Terraform.</w:t>
-      </w:r>
-    </w:p>
-    <w:p>
-      <w:pPr>
-        <w:spacing w:after="0" w:line="240" w:lineRule="auto"/>
-        <w:ind w:left="720"/>
-        <w:rPr>
-          <w:sz w:val="20"/>
-          <w:szCs w:val="20"/>
-        </w:rPr>
-      </w:pPr>
-      <w:r>
-        <w:rPr>
-          <w:sz w:val="20"/>
-          <w:szCs w:val="20"/>
-        </w:rPr>
-        <w:t>• Containerization and orchestration with Docker and Kubernetes.</w:t>
-      </w:r>
-    </w:p>
-    <w:p>
-      <w:pPr>
-        <w:spacing w:after="0" w:line="240" w:lineRule="auto"/>
-        <w:ind w:left="720"/>
-        <w:rPr>
-          <w:sz w:val="20"/>
-          <w:szCs w:val="20"/>
-        </w:rPr>
-      </w:pPr>
-      <w:r>
-        <w:rPr>
-          <w:sz w:val="20"/>
-          <w:szCs w:val="20"/>
-        </w:rPr>
-        <w:t>• CI/CD tools and practices like Azure DevOps and GitHub Actions.</w:t>
-      </w:r>
-    </w:p>
-    <w:p>
-      <w:pPr>
-        <w:spacing w:after="0" w:line="240" w:lineRule="auto"/>
-        <w:ind w:left="720"/>
-        <w:rPr>
-          <w:sz w:val="20"/>
-          <w:szCs w:val="20"/>
-        </w:rPr>
-      </w:pPr>
-      <w:r>
-        <w:rPr>
-          <w:sz w:val="20"/>
-          <w:szCs w:val="20"/>
-        </w:rPr>
         <w:t>• Deep understanding of network protocols (TCP/IP, HTTP) and Zero Trust Network security model strategies.</w:t>
       </w:r>
     </w:p>
@@ -516,24 +561,6 @@
     <w:p>
       <w:pPr>
         <w:spacing w:after="0" w:line="240" w:lineRule="auto"/>
-        <w:ind w:left="720"/>
-        <w:rPr>
-          <w:sz w:val="20"/>
-          <w:szCs w:val="20"/>
-        </w:rPr>
-      </w:pPr>
-      <w:r>
-        <w:rPr>
-          <w:sz w:val="20"/>
-          <w:szCs w:val="20"/>
-        </w:rPr>
-        <w:t>• Comprehensive understanding of Software Development Lifecycle (SDL), including Scrum, Agile, and DevOps.</w:t>
-      </w:r>
-    </w:p>
-    <w:p>
-      <w:pPr>
-        <w:spacing w:after="0" w:line="240" w:lineRule="auto"/>
-        <w:ind w:left="720"/>
         <w:rPr>
           <w:rFonts w:cstheme="minorHAnsi"/>
           <w:sz w:val="22"/>
@@ -745,15 +772,6 @@
         </w:rPr>
         <w:t>Professional Experience</w:t>
       </w:r>
-      <w:r>
-        <w:rPr>
-          <w:rFonts w:asciiTheme="minorHAnsi" w:hAnsiTheme="minorHAnsi" w:cstheme="minorBidi"/>
-          <w:color w:val="538135" w:themeColor="accent6" w:themeShade="BF"/>
-          <w:sz w:val="28"/>
-          <w:szCs w:val="28"/>
-        </w:rPr>
-        <w:br/>
-      </w:r>
     </w:p>
     <w:p>
       <w:pPr>
@@ -895,15 +913,21 @@
           <w:sz w:val="20"/>
           <w:szCs w:val="20"/>
         </w:rPr>
-        <w:t xml:space="preserve"> closely with global health researchers to transform complex epidemiology and simulation data into effective visualizations. These visual tools enable stakeholders to better interpret research findings and support data-driven decision-making in the context of infectious disease eradication efforts. I lead the prototyping and delivery of packaged solutions for direct adoption by our partner researchers in leading global health institutions and LMICs. I engage in identifying gaps within research data and processes, actively seeking collaboration </w:t>
-      </w:r>
-      <w:r>
-        <w:rPr>
-          <w:sz w:val="20"/>
-          <w:szCs w:val="20"/>
-        </w:rPr>
-        <w:lastRenderedPageBreak/>
-        <w:t>opportunities with experts to foster interdisciplinary partnerships, evaluate and recommend new technology adoption to maximize the Foundation's impact in the Global Health domain.</w:t>
+        <w:t xml:space="preserve"> closely with global health researchers to transform complex epidemiology and simulation data into effective visualizations. These visual tools enable stakeholders to better interpret research findings and support data-driven decision-making in the context of infectious disease eradication efforts. I lead the prototyping and delivery of </w:t>
+      </w:r>
+      <w:r>
+        <w:rPr>
+          <w:sz w:val="20"/>
+          <w:szCs w:val="20"/>
+        </w:rPr>
+        <w:t xml:space="preserve">AI-driven </w:t>
+      </w:r>
+      <w:r>
+        <w:rPr>
+          <w:sz w:val="20"/>
+          <w:szCs w:val="20"/>
+        </w:rPr>
+        <w:t>solutions for direct adoption by our partner researchers in leading global health institutions and LMICs. I engage in identifying gaps within research data and processes, actively seeking collaboration opportunities with experts to foster interdisciplinary partnerships, evaluate and recommend new technology adoption to maximize the Foundation's impact in the Global Health domain.</w:t>
       </w:r>
     </w:p>
     <w:p>
@@ -1601,6 +1625,45 @@
         <w:t>Certifications</w:t>
       </w:r>
       <w:proofErr w:type="spellEnd"/>
+    </w:p>
+    <w:p>
+      <w:pPr>
+        <w:pStyle w:val="ListParagraph"/>
+        <w:numPr>
+          <w:ilvl w:val="0"/>
+          <w:numId w:val="1"/>
+        </w:numPr>
+        <w:spacing w:after="0" w:line="240" w:lineRule="auto"/>
+        <w:rPr>
+          <w:rFonts w:cstheme="minorHAnsi"/>
+          <w:sz w:val="20"/>
+          <w:szCs w:val="20"/>
+        </w:rPr>
+      </w:pPr>
+      <w:r>
+        <w:rPr>
+          <w:rFonts w:cstheme="minorHAnsi"/>
+          <w:sz w:val="20"/>
+          <w:szCs w:val="20"/>
+        </w:rPr>
+        <w:t>Agile Project Management</w:t>
+      </w:r>
+      <w:r>
+        <w:rPr>
+          <w:rFonts w:cstheme="minorHAnsi"/>
+          <w:sz w:val="20"/>
+          <w:szCs w:val="20"/>
+        </w:rPr>
+        <w:t>,</w:t>
+      </w:r>
+      <w:r>
+        <w:rPr>
+          <w:rFonts w:cstheme="minorHAnsi"/>
+          <w:sz w:val="20"/>
+          <w:szCs w:val="20"/>
+        </w:rPr>
+        <w:t xml:space="preserve"> Google</w:t>
+      </w:r>
     </w:p>
     <w:p>
       <w:pPr>

</xml_diff>

<commit_message>
Resume: replace m-dashes with hyphens, add lua filter to strip docx bookmarks
</commit_message>
<xml_diff>
--- a/resume/resume.docx
+++ b/resume/resume.docx
@@ -87,7 +87,6 @@
         <w:fldChar w:fldCharType="end"/>
       </w:r>
     </w:p>
-    <w:bookmarkStart w:id="9" w:name="professional-summary"/>
     <w:p>
       <w:pPr>
         <w:pStyle w:val="Heading2"/>
@@ -104,8 +103,6 @@
         <w:t xml:space="preserve">Senior Software Engineer with 18+ years of experience across data engineering, AI systems, and cloud-native software. I design and deploy production-ready AI pipelines, data platforms, and decision-support tools — translating complex research and business requirements into scalable, secure, and measurable outcomes, with a track record of stakeholder alignment from research teams to executive leadership. Experience spans global health research, enterprise software at Microsoft, and AI consulting for healthcare and finance.</w:t>
       </w:r>
     </w:p>
-    <w:bookmarkEnd w:id="9"/>
-    <w:bookmarkStart w:id="10" w:name="technical-skills"/>
     <w:p>
       <w:pPr>
         <w:pStyle w:val="Heading2"/>
@@ -222,8 +219,6 @@
         <w:t xml:space="preserve">Threat modeling, SAML, OAuth2.0, SSO; GDPR, CCPA, HIPAA; Linux systems administration and internals.</w:t>
       </w:r>
     </w:p>
-    <w:bookmarkEnd w:id="10"/>
-    <w:bookmarkStart w:id="11" w:name="soft-skills"/>
     <w:p>
       <w:pPr>
         <w:pStyle w:val="Heading2"/>
@@ -286,8 +281,6 @@
         <w:t xml:space="preserve">Security-first mindset with focus on data privacy and responsible AI; bias toward measurable outcomes over process; continuous investment in emerging AI and data engineering practices.</w:t>
       </w:r>
     </w:p>
-    <w:bookmarkEnd w:id="11"/>
-    <w:bookmarkStart w:id="18" w:name="professional-experience"/>
     <w:p>
       <w:pPr>
         <w:pStyle w:val="Heading2"/>
@@ -296,13 +289,12 @@
         <w:t xml:space="preserve">Professional Experience</w:t>
       </w:r>
     </w:p>
-    <w:bookmarkStart w:id="12" w:name="X5cc0cccb172865010750096e6e26d22e76e32f0"/>
     <w:p>
       <w:pPr>
         <w:pStyle w:val="Heading3"/>
       </w:pPr>
       <w:r>
-        <w:t xml:space="preserve">Senior Software Engineer (Data and Statistical Modeling) – Gates Foundation</w:t>
+        <w:t xml:space="preserve">Senior Software Engineer (Data and Statistical Modeling) - Gates Foundation</w:t>
       </w:r>
     </w:p>
     <w:p>
@@ -375,14 +367,12 @@
         <w:t xml:space="preserve">Led technical planning and cross-functional alignment across research, engineering, and operations — translating complex epidemiology requirements into production-grade AI systems with direct adoption by partner institutions.</w:t>
       </w:r>
     </w:p>
-    <w:bookmarkEnd w:id="12"/>
-    <w:bookmarkStart w:id="13" w:name="Xa5c16034768f43966e4563930b4e2617e65d32b"/>
     <w:p>
       <w:pPr>
         <w:pStyle w:val="Heading3"/>
       </w:pPr>
       <w:r>
-        <w:t xml:space="preserve">Senior AI Solutions Consultant – Dura Digital</w:t>
+        <w:t xml:space="preserve">Senior AI Solutions Consultant - Dura Digital</w:t>
       </w:r>
     </w:p>
     <w:p>
@@ -443,14 +433,12 @@
         <w:t xml:space="preserve">Delivered secure, scalable, and compliant AI solutions for workflow automation, translating ambiguous business requirements into actionable technical plans with measurable outcomes.</w:t>
       </w:r>
     </w:p>
-    <w:bookmarkEnd w:id="13"/>
-    <w:bookmarkStart w:id="14" w:name="software-engineer-ii-microsoft"/>
     <w:p>
       <w:pPr>
         <w:pStyle w:val="Heading3"/>
       </w:pPr>
       <w:r>
-        <w:t xml:space="preserve">Software Engineer II – Microsoft</w:t>
+        <w:t xml:space="preserve">Software Engineer II - Microsoft</w:t>
       </w:r>
     </w:p>
     <w:p>
@@ -523,8 +511,6 @@
         <w:t xml:space="preserve">Conducted threat modeling and implemented zero-trust security strategies to protect critical services and sensitive customer data; managed incident response for high-priority production outages.</w:t>
       </w:r>
     </w:p>
-    <w:bookmarkEnd w:id="14"/>
-    <w:bookmarkStart w:id="15" w:name="X38924617e4cf1fe11e1de1378b9ae19fccf2db2"/>
     <w:p>
       <w:pPr>
         <w:pStyle w:val="Heading3"/>
@@ -563,8 +549,6 @@
         <w:t xml:space="preserve">I developed secure, high-throughput, cloud applications at Microsoft's Core Platform Engineering Group. I developed APIs and microservices, identified and mitigated software vulnerabilities, enforced data privacy requirements, security, and compliance, implemented DevOps processes, and hardened resources and applications to meet world-class industry standards.</w:t>
       </w:r>
     </w:p>
-    <w:bookmarkEnd w:id="15"/>
-    <w:bookmarkStart w:id="16" w:name="software-engineer---getty-images"/>
     <w:p>
       <w:pPr>
         <w:pStyle w:val="Heading3"/>
@@ -603,8 +587,6 @@
         <w:t xml:space="preserve">I developed and tested web services and databases handling confidential financial data and the time-sensitive royalty calculation processes. Areas of experience included .NET development, relational databases, message brokers, monitoring and integration platforms, CI/CD, DevOps and Agile methodologies, and on-call engineering support. Getty Images is the global leader in multimedia and royalty services.</w:t>
       </w:r>
     </w:p>
-    <w:bookmarkEnd w:id="16"/>
-    <w:bookmarkStart w:id="17" w:name="X3d8dd5588cd264e0a83aaa77526a1bb34805905"/>
     <w:p>
       <w:pPr>
         <w:pStyle w:val="Heading3"/>
@@ -643,9 +625,6 @@
         <w:t xml:space="preserve">Designed and executed automated test suites for web, mobile, and desktop products at Fortune 100 technology clients. Built unit and integration test frameworks, wrote test plans, and led offshore and on-site QA teams.</w:t>
       </w:r>
     </w:p>
-    <w:bookmarkEnd w:id="17"/>
-    <w:bookmarkEnd w:id="18"/>
-    <w:bookmarkStart w:id="20" w:name="education"/>
     <w:p>
       <w:pPr>
         <w:pStyle w:val="Heading2"/>
@@ -654,7 +633,6 @@
         <w:t xml:space="preserve">Education</w:t>
       </w:r>
     </w:p>
-    <w:bookmarkStart w:id="19" w:name="X7b95d8729012f59fd715cc6ccfd4ef5013598cc"/>
     <w:p>
       <w:pPr>
         <w:pStyle w:val="Heading3"/>
@@ -671,9 +649,6 @@
         <w:t xml:space="preserve">Universidad del Valle de Guatemala</w:t>
       </w:r>
     </w:p>
-    <w:bookmarkEnd w:id="19"/>
-    <w:bookmarkEnd w:id="20"/>
-    <w:bookmarkStart w:id="21" w:name="certifications"/>
     <w:p>
       <w:pPr>
         <w:pStyle w:val="Heading2"/>
@@ -730,7 +705,6 @@
         <w:t xml:space="preserve">Telecommunications and Networks, America Movil</w:t>
       </w:r>
     </w:p>
-    <w:bookmarkEnd w:id="21"/>
     <w:sectPr>
       <w:pgSz w:h="15840" w:w="12240"/>
       <w:pgMar w:bottom="720" w:footer="720" w:gutter="0" w:header="720" w:left="720" w:right="720" w:top="720"/>

</xml_diff>

<commit_message>
Resume: remove all m-dashes (U+2014), replace with hyphens
</commit_message>
<xml_diff>
--- a/resume/resume.docx
+++ b/resume/resume.docx
@@ -100,7 +100,7 @@
         <w:pStyle w:val="FirstParagraph"/>
       </w:pPr>
       <w:r>
-        <w:t xml:space="preserve">Senior Software Engineer with 18+ years of experience across data engineering, AI systems, and cloud-native software. I design and deploy production-ready AI pipelines, data platforms, and decision-support tools — translating complex research and business requirements into scalable, secure, and measurable outcomes, with a track record of stakeholder alignment from research teams to executive leadership. Experience spans global health research, enterprise software at Microsoft, and AI consulting for healthcare and finance.</w:t>
+        <w:t xml:space="preserve">Senior Software Engineer with 18+ years of experience across data engineering, AI systems, and cloud-native software. I design and deploy production-ready AI pipelines, data platforms, and decision-support tools - translating complex research and business requirements into scalable, secure, and measurable outcomes, with a track record of stakeholder alignment from research teams to executive leadership. Experience spans global health research, enterprise software at Microsoft, and AI consulting for healthcare and finance.</w:t>
       </w:r>
     </w:p>
     <w:p>
@@ -328,7 +328,7 @@
         </w:numPr>
       </w:pPr>
       <w:r>
-        <w:t xml:space="preserve">Architected AI-powered epidemiology dashboards deployed for national malaria eradication programs in Nigeria, Senegal, and Benin — surfacing key disease indicators, intervention cost-effectiveness, and national strategy scenario simulations used by health ministries and research partners to drive data-informed policy decisions.</w:t>
+        <w:t xml:space="preserve">Architected AI-powered epidemiology dashboards deployed for national malaria eradication programs in Nigeria, Senegal, and Benin - surfacing key disease indicators, intervention cost-effectiveness, and national strategy scenario simulations used by health ministries and research partners to drive data-informed policy decisions.</w:t>
       </w:r>
     </w:p>
     <w:p>
@@ -364,7 +364,7 @@
         </w:numPr>
       </w:pPr>
       <w:r>
-        <w:t xml:space="preserve">Led technical planning and cross-functional alignment across research, engineering, and operations — translating complex epidemiology requirements into production-grade AI systems with direct adoption by partner institutions.</w:t>
+        <w:t xml:space="preserve">Led technical planning and cross-functional alignment across research, engineering, and operations - translating complex epidemiology requirements into production-grade AI systems with direct adoption by partner institutions.</w:t>
       </w:r>
     </w:p>
     <w:p>
@@ -406,7 +406,7 @@
         </w:numPr>
       </w:pPr>
       <w:r>
-        <w:t xml:space="preserve">Provided architectural direction and implementation strategy for healthcare and financial organizations adopting ML/AI tooling and infrastructure — serving as trusted technical advisor during early AI adoption phases.</w:t>
+        <w:t xml:space="preserve">Provided architectural direction and implementation strategy for healthcare and financial organizations adopting ML/AI tooling and infrastructure - serving as trusted technical advisor during early AI adoption phases.</w:t>
       </w:r>
     </w:p>
     <w:p>

</xml_diff>

<commit_message>
Resume: add Personal Projects section - RAG pipeline + multi-agent system, expand AI/ML skills
</commit_message>
<xml_diff>
--- a/resume/resume.docx
+++ b/resume/resume.docx
@@ -126,7 +126,7 @@
         <w:t xml:space="preserve"> </w:t>
       </w:r>
       <w:r>
-        <w:t xml:space="preserve">LLMs, AI agents, multi-agent systems, RAG, NLP (natural language processing), intelligent automation, MLOps; OpenAI SDK, Anthropic Claude SDK, Azure OpenAI, Azure AI Foundry; LangChain, LangGraph; local LLMs for prototyping; Databricks; prompt, context, and token optimization (FinOps for AI); model selection, evaluation, and A/B testing; AI guardrails and Responsible AI practices.</w:t>
+        <w:t xml:space="preserve">LLMs, AI agents, multi-agent systems, RAG, NLP (natural language processing), intelligent automation, MLOps; OpenAI SDK, Anthropic Claude SDK, Azure OpenAI, Azure AI Foundry; LangChain, LangGraph; local LLMs for prototyping; Databricks; prompt, context, and token optimization (FinOps for AI); model selection, evaluation, and A/B testing; AI guardrails and Responsible AI practices; document ingestion pipelines (multi-format: PDF, DOCX, email, OCR), recursive chunking, sentence-transformers embeddings, hybrid search (vector + BM25/RRF), sqlite-vec and pgvector; multi-agent supervisor orchestration patterns (LangGraph-equivalent: supervisor node, conditional routing, async interrupt/resume).</w:t>
       </w:r>
     </w:p>
     <w:p>
@@ -279,6 +279,194 @@
       </w:r>
       <w:r>
         <w:t xml:space="preserve">Security-first mindset with focus on data privacy and responsible AI; bias toward measurable outcomes over process; continuous investment in emerging AI and data engineering practices.</w:t>
+      </w:r>
+    </w:p>
+    <w:p>
+      <w:pPr>
+        <w:pStyle w:val="Heading2"/>
+      </w:pPr>
+      <w:r>
+        <w:t xml:space="preserve">Personal Projects</w:t>
+      </w:r>
+    </w:p>
+    <w:p>
+      <w:pPr>
+        <w:pStyle w:val="Heading3"/>
+      </w:pPr>
+      <w:r>
+        <w:t xml:space="preserve">Legal Document Intelligence System</w:t>
+      </w:r>
+    </w:p>
+    <w:p>
+      <w:pPr>
+        <w:pStyle w:val="FirstParagraph"/>
+      </w:pPr>
+      <w:r>
+        <w:rPr>
+          <w:i/>
+          <w:iCs/>
+        </w:rPr>
+        <w:t xml:space="preserve">2025 - Present</w:t>
+      </w:r>
+    </w:p>
+    <w:p>
+      <w:pPr>
+        <w:pStyle w:val="BodyText"/>
+      </w:pPr>
+      <w:r>
+        <w:t xml:space="preserve">Built a production RAG pipeline for legal document analysis from scratch. Source connectors for Gmail API and OneDrive, multi-format extraction (PDF, DOCX, EML, XLSX, images via OCR), and a classification layer that enriches document metadata before indexing. Recursive chunking (800 chars / 150 overlap) tuned for legal prose, vector embeddings with sentence-transformers (all-mpnet-base-v2, 768 dims), and hybrid semantic search using sqlite-vec with metadata filters. In LangChain terms:</w:t>
+      </w:r>
+      <w:r>
+        <w:t xml:space="preserve"> </w:t>
+      </w:r>
+      <w:r>
+        <w:rPr>
+          <w:rStyle w:val="VerbatimChar"/>
+        </w:rPr>
+        <w:t xml:space="preserve">DocumentLoader</w:t>
+      </w:r>
+      <w:r>
+        <w:t xml:space="preserve"> </w:t>
+      </w:r>
+      <w:r>
+        <w:t xml:space="preserve">+</w:t>
+      </w:r>
+      <w:r>
+        <w:t xml:space="preserve"> </w:t>
+      </w:r>
+      <w:r>
+        <w:rPr>
+          <w:rStyle w:val="VerbatimChar"/>
+        </w:rPr>
+        <w:t xml:space="preserve">DocumentTransformer</w:t>
+      </w:r>
+      <w:r>
+        <w:t xml:space="preserve"> </w:t>
+      </w:r>
+      <w:r>
+        <w:t xml:space="preserve">+</w:t>
+      </w:r>
+      <w:r>
+        <w:t xml:space="preserve"> </w:t>
+      </w:r>
+      <w:r>
+        <w:rPr>
+          <w:rStyle w:val="VerbatimChar"/>
+        </w:rPr>
+        <w:t xml:space="preserve">RecursiveCharacterTextSplitter</w:t>
+      </w:r>
+      <w:r>
+        <w:t xml:space="preserve"> </w:t>
+      </w:r>
+      <w:r>
+        <w:t xml:space="preserve">+</w:t>
+      </w:r>
+      <w:r>
+        <w:t xml:space="preserve"> </w:t>
+      </w:r>
+      <w:r>
+        <w:rPr>
+          <w:rStyle w:val="VerbatimChar"/>
+        </w:rPr>
+        <w:t xml:space="preserve">VectorStore</w:t>
+      </w:r>
+      <w:r>
+        <w:t xml:space="preserve"> </w:t>
+      </w:r>
+      <w:r>
+        <w:t xml:space="preserve">pipeline. In LlamaIndex:</w:t>
+      </w:r>
+      <w:r>
+        <w:t xml:space="preserve"> </w:t>
+      </w:r>
+      <w:r>
+        <w:rPr>
+          <w:rStyle w:val="VerbatimChar"/>
+        </w:rPr>
+        <w:t xml:space="preserve">SimpleDirectoryReader</w:t>
+      </w:r>
+      <w:r>
+        <w:t xml:space="preserve"> </w:t>
+      </w:r>
+      <w:r>
+        <w:t xml:space="preserve">with custom</w:t>
+      </w:r>
+      <w:r>
+        <w:t xml:space="preserve"> </w:t>
+      </w:r>
+      <w:r>
+        <w:rPr>
+          <w:rStyle w:val="VerbatimChar"/>
+        </w:rPr>
+        <w:t xml:space="preserve">MetadataExtractor</w:t>
+      </w:r>
+      <w:r>
+        <w:t xml:space="preserve"> </w:t>
+      </w:r>
+      <w:r>
+        <w:t xml:space="preserve">+</w:t>
+      </w:r>
+      <w:r>
+        <w:t xml:space="preserve"> </w:t>
+      </w:r>
+      <w:r>
+        <w:rPr>
+          <w:rStyle w:val="VerbatimChar"/>
+        </w:rPr>
+        <w:t xml:space="preserve">SentenceSplitter</w:t>
+      </w:r>
+      <w:r>
+        <w:t xml:space="preserve"> </w:t>
+      </w:r>
+      <w:r>
+        <w:t xml:space="preserve">+</w:t>
+      </w:r>
+      <w:r>
+        <w:t xml:space="preserve"> </w:t>
+      </w:r>
+      <w:r>
+        <w:rPr>
+          <w:rStyle w:val="VerbatimChar"/>
+        </w:rPr>
+        <w:t xml:space="preserve">VectorStoreIndex</w:t>
+      </w:r>
+      <w:r>
+        <w:t xml:space="preserve">. 314 documents, 4,391 chunks, sub-200ms queries.</w:t>
+      </w:r>
+    </w:p>
+    <w:p>
+      <w:pPr>
+        <w:pStyle w:val="BodyText"/>
+      </w:pPr>
+      <w:r>
+        <w:t xml:space="preserve">Also designed and operate a multi-agent personal assistant system with a supervisor orchestration pattern: a primary agent routes tasks to specialized agents (code, legal, research) based on task type and cost. Async delegation via spawn/yield maps to LangGraph’s interrupt/resume pattern. Each agent is tool-augmented with typed schemas equivalent to LangChain</w:t>
+      </w:r>
+      <w:r>
+        <w:t xml:space="preserve"> </w:t>
+      </w:r>
+      <w:r>
+        <w:rPr>
+          <w:rStyle w:val="VerbatimChar"/>
+        </w:rPr>
+        <w:t xml:space="preserve">StructuredTool</w:t>
+      </w:r>
+      <w:r>
+        <w:t xml:space="preserve"> </w:t>
+      </w:r>
+      <w:r>
+        <w:t xml:space="preserve">/ LlamaIndex</w:t>
+      </w:r>
+      <w:r>
+        <w:t xml:space="preserve"> </w:t>
+      </w:r>
+      <w:r>
+        <w:rPr>
+          <w:rStyle w:val="VerbatimChar"/>
+        </w:rPr>
+        <w:t xml:space="preserve">FunctionTool</w:t>
+      </w:r>
+      <w:r>
+        <w:t xml:space="preserve">.</w:t>
       </w:r>
     </w:p>
     <w:p>

</xml_diff>

<commit_message>
Resume: trim fluff - cut soft skills section, tighten summary and older roles, condense personal projects
</commit_message>
<xml_diff>
--- a/resume/resume.docx
+++ b/resume/resume.docx
@@ -100,7 +100,7 @@
         <w:pStyle w:val="FirstParagraph"/>
       </w:pPr>
       <w:r>
-        <w:t xml:space="preserve">Senior Software Engineer with 18+ years of experience across data engineering, AI systems, and cloud-native software. I design and deploy production-ready AI pipelines, data platforms, and decision-support tools - translating complex research and business requirements into scalable, secure, and measurable outcomes, with a track record of stakeholder alignment from research teams to executive leadership. Experience spans global health research, enterprise software at Microsoft, and AI consulting for healthcare and finance.</w:t>
+        <w:t xml:space="preserve">Senior Software Engineer with 18+ years of experience across data engineering, AI systems, and cloud-native software. I design and deploy production-ready AI pipelines, data platforms, and decision-support tools - translating complex technical requirements into scalable, secure, and measurable outcomes. Experience spans global health research, enterprise software at Microsoft, and AI consulting for healthcare and finance.</w:t>
       </w:r>
     </w:p>
     <w:p>
@@ -224,68 +224,6 @@
         <w:pStyle w:val="Heading2"/>
       </w:pPr>
       <w:r>
-        <w:t xml:space="preserve">Soft Skills</w:t>
-      </w:r>
-    </w:p>
-    <w:p>
-      <w:pPr>
-        <w:pStyle w:val="FirstParagraph"/>
-      </w:pPr>
-      <w:r>
-        <w:rPr>
-          <w:b/>
-          <w:bCs/>
-        </w:rPr>
-        <w:t xml:space="preserve">Delivery &amp; Leadership:</w:t>
-      </w:r>
-      <w:r>
-        <w:t xml:space="preserve"> </w:t>
-      </w:r>
-      <w:r>
-        <w:t xml:space="preserve">Technical strategy and roadmap ownership across ambiguous, high-stakes problem spaces; cross-functional alignment from engineering to executive stakeholders; mentorship and technical leveling of engineering teams.</w:t>
-      </w:r>
-    </w:p>
-    <w:p>
-      <w:pPr>
-        <w:pStyle w:val="BodyText"/>
-      </w:pPr>
-      <w:r>
-        <w:rPr>
-          <w:b/>
-          <w:bCs/>
-        </w:rPr>
-        <w:t xml:space="preserve">Communication &amp; Influence:</w:t>
-      </w:r>
-      <w:r>
-        <w:t xml:space="preserve"> </w:t>
-      </w:r>
-      <w:r>
-        <w:t xml:space="preserve">Translating complex technical tradeoffs into clear recommendations for non-technical decision-makers; driving consensus across research, engineering, and operations; trusted advisor role in AI adoption for regulated domains; embedding with domain experts (epidemiology, global health) to rapidly acquire working knowledge and translate it into production technical requirements.</w:t>
-      </w:r>
-    </w:p>
-    <w:p>
-      <w:pPr>
-        <w:pStyle w:val="BodyText"/>
-      </w:pPr>
-      <w:r>
-        <w:rPr>
-          <w:b/>
-          <w:bCs/>
-        </w:rPr>
-        <w:t xml:space="preserve">Professional:</w:t>
-      </w:r>
-      <w:r>
-        <w:t xml:space="preserve"> </w:t>
-      </w:r>
-      <w:r>
-        <w:t xml:space="preserve">Security-first mindset with focus on data privacy and responsible AI; bias toward measurable outcomes over process; continuous investment in emerging AI and data engineering practices.</w:t>
-      </w:r>
-    </w:p>
-    <w:p>
-      <w:pPr>
-        <w:pStyle w:val="Heading2"/>
-      </w:pPr>
-      <w:r>
         <w:t xml:space="preserve">Personal Projects</w:t>
       </w:r>
     </w:p>
@@ -314,124 +252,7 @@
         <w:pStyle w:val="BodyText"/>
       </w:pPr>
       <w:r>
-        <w:t xml:space="preserve">Built a production RAG pipeline for legal document analysis from scratch. Source connectors for Gmail API and OneDrive, multi-format extraction (PDF, DOCX, EML, XLSX, images via OCR), and a classification layer that enriches document metadata before indexing. Recursive chunking (800 chars / 150 overlap) tuned for legal prose, vector embeddings with sentence-transformers (all-mpnet-base-v2, 768 dims), and hybrid semantic search using sqlite-vec with metadata filters. In LangChain terms:</w:t>
-      </w:r>
-      <w:r>
-        <w:t xml:space="preserve"> </w:t>
-      </w:r>
-      <w:r>
-        <w:rPr>
-          <w:rStyle w:val="VerbatimChar"/>
-        </w:rPr>
-        <w:t xml:space="preserve">DocumentLoader</w:t>
-      </w:r>
-      <w:r>
-        <w:t xml:space="preserve"> </w:t>
-      </w:r>
-      <w:r>
-        <w:t xml:space="preserve">+</w:t>
-      </w:r>
-      <w:r>
-        <w:t xml:space="preserve"> </w:t>
-      </w:r>
-      <w:r>
-        <w:rPr>
-          <w:rStyle w:val="VerbatimChar"/>
-        </w:rPr>
-        <w:t xml:space="preserve">DocumentTransformer</w:t>
-      </w:r>
-      <w:r>
-        <w:t xml:space="preserve"> </w:t>
-      </w:r>
-      <w:r>
-        <w:t xml:space="preserve">+</w:t>
-      </w:r>
-      <w:r>
-        <w:t xml:space="preserve"> </w:t>
-      </w:r>
-      <w:r>
-        <w:rPr>
-          <w:rStyle w:val="VerbatimChar"/>
-        </w:rPr>
-        <w:t xml:space="preserve">RecursiveCharacterTextSplitter</w:t>
-      </w:r>
-      <w:r>
-        <w:t xml:space="preserve"> </w:t>
-      </w:r>
-      <w:r>
-        <w:t xml:space="preserve">+</w:t>
-      </w:r>
-      <w:r>
-        <w:t xml:space="preserve"> </w:t>
-      </w:r>
-      <w:r>
-        <w:rPr>
-          <w:rStyle w:val="VerbatimChar"/>
-        </w:rPr>
-        <w:t xml:space="preserve">VectorStore</w:t>
-      </w:r>
-      <w:r>
-        <w:t xml:space="preserve"> </w:t>
-      </w:r>
-      <w:r>
-        <w:t xml:space="preserve">pipeline. In LlamaIndex:</w:t>
-      </w:r>
-      <w:r>
-        <w:t xml:space="preserve"> </w:t>
-      </w:r>
-      <w:r>
-        <w:rPr>
-          <w:rStyle w:val="VerbatimChar"/>
-        </w:rPr>
-        <w:t xml:space="preserve">SimpleDirectoryReader</w:t>
-      </w:r>
-      <w:r>
-        <w:t xml:space="preserve"> </w:t>
-      </w:r>
-      <w:r>
-        <w:t xml:space="preserve">with custom</w:t>
-      </w:r>
-      <w:r>
-        <w:t xml:space="preserve"> </w:t>
-      </w:r>
-      <w:r>
-        <w:rPr>
-          <w:rStyle w:val="VerbatimChar"/>
-        </w:rPr>
-        <w:t xml:space="preserve">MetadataExtractor</w:t>
-      </w:r>
-      <w:r>
-        <w:t xml:space="preserve"> </w:t>
-      </w:r>
-      <w:r>
-        <w:t xml:space="preserve">+</w:t>
-      </w:r>
-      <w:r>
-        <w:t xml:space="preserve"> </w:t>
-      </w:r>
-      <w:r>
-        <w:rPr>
-          <w:rStyle w:val="VerbatimChar"/>
-        </w:rPr>
-        <w:t xml:space="preserve">SentenceSplitter</w:t>
-      </w:r>
-      <w:r>
-        <w:t xml:space="preserve"> </w:t>
-      </w:r>
-      <w:r>
-        <w:t xml:space="preserve">+</w:t>
-      </w:r>
-      <w:r>
-        <w:t xml:space="preserve"> </w:t>
-      </w:r>
-      <w:r>
-        <w:rPr>
-          <w:rStyle w:val="VerbatimChar"/>
-        </w:rPr>
-        <w:t xml:space="preserve">VectorStoreIndex</w:t>
-      </w:r>
-      <w:r>
-        <w:t xml:space="preserve">. 314 documents, 4,391 chunks, sub-200ms queries.</w:t>
+        <w:t xml:space="preserve">Built a production RAG pipeline for legal document analysis: Gmail API and OneDrive source connectors, multi-format extraction (PDF, DOCX, EML, XLSX, OCR), classification-first metadata enrichment, recursive chunking tuned for legal prose, sentence-transformers embeddings (768 dims), and semantic search with sqlite-vec. 314 documents, 4,391 chunks, sub-200ms queries.</w:t>
       </w:r>
     </w:p>
     <w:p>
@@ -439,34 +260,7 @@
         <w:pStyle w:val="BodyText"/>
       </w:pPr>
       <w:r>
-        <w:t xml:space="preserve">Also designed and operate a multi-agent personal assistant system with a supervisor orchestration pattern: a primary agent routes tasks to specialized agents (code, legal, research) based on task type and cost. Async delegation via spawn/yield maps to LangGraph’s interrupt/resume pattern. Each agent is tool-augmented with typed schemas equivalent to LangChain</w:t>
-      </w:r>
-      <w:r>
-        <w:t xml:space="preserve"> </w:t>
-      </w:r>
-      <w:r>
-        <w:rPr>
-          <w:rStyle w:val="VerbatimChar"/>
-        </w:rPr>
-        <w:t xml:space="preserve">StructuredTool</w:t>
-      </w:r>
-      <w:r>
-        <w:t xml:space="preserve"> </w:t>
-      </w:r>
-      <w:r>
-        <w:t xml:space="preserve">/ LlamaIndex</w:t>
-      </w:r>
-      <w:r>
-        <w:t xml:space="preserve"> </w:t>
-      </w:r>
-      <w:r>
-        <w:rPr>
-          <w:rStyle w:val="VerbatimChar"/>
-        </w:rPr>
-        <w:t xml:space="preserve">FunctionTool</w:t>
-      </w:r>
-      <w:r>
-        <w:t xml:space="preserve">.</w:t>
+        <w:t xml:space="preserve">Designed and operate a multi-agent assistant system with supervisor orchestration: primary agent routes tasks to specialized agents (code, legal, research) by type and cost. Async delegation pattern maps to LangGraph interrupt/resume. Each agent is tool-augmented with typed input/output schemas.</w:t>
       </w:r>
     </w:p>
     <w:p>
@@ -494,10 +288,10 @@
           <w:i/>
           <w:iCs/>
         </w:rPr>
-        <w:t xml:space="preserve">2025 – Current</w:t>
-      </w:r>
-      <w:r>
-        <w:br/>
+        <w:t xml:space="preserve">2025 - Current</w:t>
+      </w:r>
+      <w:r>
+        <w:t xml:space="preserve"> </w:t>
       </w:r>
       <w:r>
         <w:rPr>
@@ -516,7 +310,7 @@
         </w:numPr>
       </w:pPr>
       <w:r>
-        <w:t xml:space="preserve">Architected AI-powered epidemiology dashboards deployed for national malaria eradication programs in Nigeria, Senegal, and Benin - surfacing key disease indicators, intervention cost-effectiveness, and national strategy scenario simulations used by health ministries and research partners to drive data-informed policy decisions.</w:t>
+        <w:t xml:space="preserve">Architected AI-powered epidemiology dashboards for national malaria eradication programs in Nigeria, Senegal, and Benin - surfacing disease indicators, intervention cost-effectiveness, and scenario simulations used by health ministries to drive policy decisions.</w:t>
       </w:r>
     </w:p>
     <w:p>
@@ -528,7 +322,7 @@
         </w:numPr>
       </w:pPr>
       <w:r>
-        <w:t xml:space="preserve">Built end-to-end data pipelines from epidemiology and disease simulation outputs to interactive decision-support visualizations, enabling IDM researchers and partner institutions to model intervention scenarios and project outcomes of national eradication strategies.</w:t>
+        <w:t xml:space="preserve">Built end-to-end data pipelines from disease simulation outputs to interactive decision-support visualizations for IDM researchers and partner institutions.</w:t>
       </w:r>
     </w:p>
     <w:p>
@@ -540,7 +334,7 @@
         </w:numPr>
       </w:pPr>
       <w:r>
-        <w:t xml:space="preserve">Applied production AI practices across the research-to-deployment pipeline: data quality controls, privacy-by-design, prompt engineering, evaluation pipelines, and DevSecOps (CI/CD, automated security reviews) for global health research environments.</w:t>
+        <w:t xml:space="preserve">Applied production AI practices across the full pipeline: data quality controls, privacy-by-design, prompt engineering, evaluation pipelines, and DevSecOps for global health research environments.</w:t>
       </w:r>
     </w:p>
     <w:p>
@@ -552,7 +346,7 @@
         </w:numPr>
       </w:pPr>
       <w:r>
-        <w:t xml:space="preserve">Led technical planning and cross-functional alignment across research, engineering, and operations - translating complex epidemiology requirements into production-grade AI systems with direct adoption by partner institutions.</w:t>
+        <w:t xml:space="preserve">Led cross-functional technical planning across research, engineering, and operations - translating epidemiology requirements into production AI systems adopted by partner institutions.</w:t>
       </w:r>
     </w:p>
     <w:p>
@@ -572,10 +366,10 @@
           <w:i/>
           <w:iCs/>
         </w:rPr>
-        <w:t xml:space="preserve">2025 – Current</w:t>
-      </w:r>
-      <w:r>
-        <w:br/>
+        <w:t xml:space="preserve">2025 - Current</w:t>
+      </w:r>
+      <w:r>
+        <w:t xml:space="preserve"> </w:t>
       </w:r>
       <w:r>
         <w:rPr>
@@ -638,10 +432,10 @@
           <w:i/>
           <w:iCs/>
         </w:rPr>
-        <w:t xml:space="preserve">2019 – 2025</w:t>
-      </w:r>
-      <w:r>
-        <w:br/>
+        <w:t xml:space="preserve">2019 - 2025</w:t>
+      </w:r>
+      <w:r>
+        <w:t xml:space="preserve"> </w:t>
       </w:r>
       <w:r>
         <w:rPr>
@@ -731,10 +525,14 @@
     </w:p>
     <w:p>
       <w:pPr>
-        <w:pStyle w:val="BodyText"/>
-      </w:pPr>
-      <w:r>
-        <w:t xml:space="preserve">I developed secure, high-throughput, cloud applications at Microsoft's Core Platform Engineering Group. I developed APIs and microservices, identified and mitigated software vulnerabilities, enforced data privacy requirements, security, and compliance, implemented DevOps processes, and hardened resources and applications to meet world-class industry standards.</w:t>
+        <w:pStyle w:val="Compact"/>
+        <w:numPr>
+          <w:ilvl w:val="0"/>
+          <w:numId w:val="1004"/>
+        </w:numPr>
+      </w:pPr>
+      <w:r>
+        <w:t xml:space="preserve">Built secure, high-throughput cloud applications at Microsoft’s Core Platform Engineering Group: APIs and microservices, vulnerability mitigation, data privacy compliance, DevOps, and security hardening.</w:t>
       </w:r>
     </w:p>
     <w:p>
@@ -769,10 +567,14 @@
     </w:p>
     <w:p>
       <w:pPr>
-        <w:pStyle w:val="BodyText"/>
-      </w:pPr>
-      <w:r>
-        <w:t xml:space="preserve">I developed and tested web services and databases handling confidential financial data and the time-sensitive royalty calculation processes. Areas of experience included .NET development, relational databases, message brokers, monitoring and integration platforms, CI/CD, DevOps and Agile methodologies, and on-call engineering support. Getty Images is the global leader in multimedia and royalty services.</w:t>
+        <w:pStyle w:val="Compact"/>
+        <w:numPr>
+          <w:ilvl w:val="0"/>
+          <w:numId w:val="1005"/>
+        </w:numPr>
+      </w:pPr>
+      <w:r>
+        <w:t xml:space="preserve">Developed and tested web services and databases for financial data processing and royalty calculations: .NET, relational databases, message brokers, monitoring platforms, CI/CD, and on-call engineering support.</w:t>
       </w:r>
     </w:p>
     <w:p>
@@ -792,10 +594,10 @@
           <w:i/>
           <w:iCs/>
         </w:rPr>
-        <w:t xml:space="preserve">2007 – 2012</w:t>
-      </w:r>
-      <w:r>
-        <w:br/>
+        <w:t xml:space="preserve">2007 - 2012</w:t>
+      </w:r>
+      <w:r>
+        <w:t xml:space="preserve"> </w:t>
       </w:r>
       <w:r>
         <w:rPr>
@@ -850,7 +652,7 @@
         <w:pStyle w:val="Compact"/>
         <w:numPr>
           <w:ilvl w:val="0"/>
-          <w:numId w:val="1004"/>
+          <w:numId w:val="1006"/>
         </w:numPr>
       </w:pPr>
       <w:r>
@@ -862,7 +664,7 @@
         <w:pStyle w:val="Compact"/>
         <w:numPr>
           <w:ilvl w:val="0"/>
-          <w:numId w:val="1004"/>
+          <w:numId w:val="1006"/>
         </w:numPr>
       </w:pPr>
       <w:r>
@@ -874,7 +676,7 @@
         <w:pStyle w:val="Compact"/>
         <w:numPr>
           <w:ilvl w:val="0"/>
-          <w:numId w:val="1004"/>
+          <w:numId w:val="1006"/>
         </w:numPr>
       </w:pPr>
       <w:r>
@@ -886,7 +688,7 @@
         <w:pStyle w:val="Compact"/>
         <w:numPr>
           <w:ilvl w:val="0"/>
-          <w:numId w:val="1004"/>
+          <w:numId w:val="1006"/>
         </w:numPr>
       </w:pPr>
       <w:r>
@@ -1352,6 +1154,12 @@
     <w:abstractNumId w:val="991"/>
   </w:num>
   <w:num w:numId="1004">
+    <w:abstractNumId w:val="991"/>
+  </w:num>
+  <w:num w:numId="1005">
+    <w:abstractNumId w:val="991"/>
+  </w:num>
+  <w:num w:numId="1006">
     <w:abstractNumId w:val="991"/>
   </w:num>
 </w:numbering>

</xml_diff>

<commit_message>
Resume: restore soft skills section (condensed)
</commit_message>
<xml_diff>
--- a/resume/resume.docx
+++ b/resume/resume.docx
@@ -217,6 +217,68 @@
       </w:r>
       <w:r>
         <w:t xml:space="preserve">Threat modeling, SAML, OAuth2.0, SSO; GDPR, CCPA, HIPAA; Linux systems administration and internals.</w:t>
+      </w:r>
+    </w:p>
+    <w:p>
+      <w:pPr>
+        <w:pStyle w:val="Heading2"/>
+      </w:pPr>
+      <w:r>
+        <w:t xml:space="preserve">Soft Skills</w:t>
+      </w:r>
+    </w:p>
+    <w:p>
+      <w:pPr>
+        <w:pStyle w:val="FirstParagraph"/>
+      </w:pPr>
+      <w:r>
+        <w:rPr>
+          <w:b/>
+          <w:bCs/>
+        </w:rPr>
+        <w:t xml:space="preserve">Leadership:</w:t>
+      </w:r>
+      <w:r>
+        <w:t xml:space="preserve"> </w:t>
+      </w:r>
+      <w:r>
+        <w:t xml:space="preserve">Technical strategy ownership in ambiguous problem spaces; cross-functional alignment from engineering to executive stakeholders; mentorship and technical leveling of engineering teams.</w:t>
+      </w:r>
+    </w:p>
+    <w:p>
+      <w:pPr>
+        <w:pStyle w:val="BodyText"/>
+      </w:pPr>
+      <w:r>
+        <w:rPr>
+          <w:b/>
+          <w:bCs/>
+        </w:rPr>
+        <w:t xml:space="preserve">Communication:</w:t>
+      </w:r>
+      <w:r>
+        <w:t xml:space="preserve"> </w:t>
+      </w:r>
+      <w:r>
+        <w:t xml:space="preserve">Translating technical tradeoffs into clear recommendations for non-technical decision-makers; trusted advisor role in AI adoption for regulated domains; rapidly acquiring domain knowledge (epidemiology, global health) and translating it into production requirements.</w:t>
+      </w:r>
+    </w:p>
+    <w:p>
+      <w:pPr>
+        <w:pStyle w:val="BodyText"/>
+      </w:pPr>
+      <w:r>
+        <w:rPr>
+          <w:b/>
+          <w:bCs/>
+        </w:rPr>
+        <w:t xml:space="preserve">Professional:</w:t>
+      </w:r>
+      <w:r>
+        <w:t xml:space="preserve"> </w:t>
+      </w:r>
+      <w:r>
+        <w:t xml:space="preserve">Security-first mindset; responsible AI and data privacy focus; bias toward measurable outcomes over process.</w:t>
       </w:r>
     </w:p>
     <w:p>

</xml_diff>

<commit_message>
Resume: add Semantic Analysis Platform to personal projects
</commit_message>
<xml_diff>
--- a/resume/resume.docx
+++ b/resume/resume.docx
@@ -323,6 +323,34 @@
       </w:pPr>
       <w:r>
         <w:t xml:space="preserve">Designed and operate a multi-agent assistant system with supervisor orchestration: primary agent routes tasks to specialized agents (code, legal, research) by type and cost. Async delegation pattern maps to LangGraph interrupt/resume. Each agent is tool-augmented with typed input/output schemas.</w:t>
+      </w:r>
+    </w:p>
+    <w:p>
+      <w:pPr>
+        <w:pStyle w:val="Heading3"/>
+      </w:pPr>
+      <w:r>
+        <w:t xml:space="preserve">Semantic Analysis Platform</w:t>
+      </w:r>
+    </w:p>
+    <w:p>
+      <w:pPr>
+        <w:pStyle w:val="FirstParagraph"/>
+      </w:pPr>
+      <w:r>
+        <w:rPr>
+          <w:i/>
+          <w:iCs/>
+        </w:rPr>
+        <w:t xml:space="preserve">2026 - Present</w:t>
+      </w:r>
+    </w:p>
+    <w:p>
+      <w:pPr>
+        <w:pStyle w:val="BodyText"/>
+      </w:pPr>
+      <w:r>
+        <w:t xml:space="preserve">Built a full-stack document intelligence platform for multi-source ingestion, semantic analysis, and knowledge mapping. FastAPI backend + React frontend; ingests URLs, PDFs, and text with automated AI suspicion and quality ratings post-ingest. LLM pipeline performs semantic chunking by logical section (chapter/article boundaries), extracts concept graphs per section, merges partial graphs with deduplication, and runs a consolidation pass for semantic synonym resolution, covering 100% of the document. Fact-check feature extracts verifiable claims, queries Perplexity, and feeds results back into the quality score. Three synchronized views (concept map, chat, document) over the same content, with bidirectional highlight and navigation between views.</w:t>
       </w:r>
     </w:p>
     <w:p>

</xml_diff>

<commit_message>
Resume: add knowledge graphs, semantic extraction, LLM quality scoring, React to technical skills
</commit_message>
<xml_diff>
--- a/resume/resume.docx
+++ b/resume/resume.docx
@@ -126,7 +126,7 @@
         <w:t xml:space="preserve"> </w:t>
       </w:r>
       <w:r>
-        <w:t xml:space="preserve">LLMs, AI agents, multi-agent systems, RAG, NLP (natural language processing), intelligent automation, MLOps; OpenAI SDK, Anthropic Claude SDK, Azure OpenAI, Azure AI Foundry; LangChain, LangGraph; local LLMs for prototyping; Databricks; prompt, context, and token optimization (FinOps for AI); model selection, evaluation, and A/B testing; AI guardrails and Responsible AI practices; document ingestion pipelines (multi-format: PDF, DOCX, email, OCR), recursive chunking, sentence-transformers embeddings, hybrid search (vector + BM25/RRF), sqlite-vec and pgvector; multi-agent supervisor orchestration patterns (LangGraph-equivalent: supervisor node, conditional routing, async interrupt/resume).</w:t>
+        <w:t xml:space="preserve">LLMs, AI agents, multi-agent systems, RAG, NLP (natural language processing), intelligent automation, MLOps; OpenAI SDK, Anthropic Claude SDK, Azure OpenAI, Azure AI Foundry; LangChain, LangGraph; knowledge graphs, semantic concept extraction; local LLMs for prototyping; Databricks; prompt, context, and token optimization (FinOps for AI); model selection, evaluation, and A/B testing; automated LLM-based quality scoring pipelines; AI guardrails and Responsible AI practices; document ingestion pipelines (multi-format: PDF, DOCX, email, OCR), recursive chunking, sentence-transformers embeddings, hybrid search (vector + BM25/RRF), sqlite-vec and pgvector; multi-agent supervisor orchestration patterns (LangGraph-equivalent: supervisor node, conditional routing, async interrupt/resume).</w:t>
       </w:r>
     </w:p>
     <w:p>
@@ -162,7 +162,7 @@
         <w:t xml:space="preserve"> </w:t>
       </w:r>
       <w:r>
-        <w:t xml:space="preserve">Python, C#, JavaScript, TypeScript, R, SQL, PowerShell.</w:t>
+        <w:t xml:space="preserve">Python, C#, JavaScript, TypeScript, React, R, SQL, PowerShell.</w:t>
       </w:r>
     </w:p>
     <w:p>

</xml_diff>